<commit_message>
docs(gestion): revue des fiches — lanceur de test des lumières réparé, fiches alignées sur le jeu
- Tester les lumieres.bat : une tabulation remplaçait « \t » dans
  outils\test-hue.js depuis le 2026-10-16 ; le double-clic ne trouvait
  pas l'outil.
- Mise en place : exemple d'adresse = adresse fixe du routeur ;
  « Yeux fermés. » (le texte réel des téléphones) ; les Sœurs se
  connaissent dès le début.
- Pitch et prospection : même durée que les plaquettes et la grille de
  prix ; prix → fiche 6 ; tâches déjà faites retirées ; préparation de
  l'appel du séminaire → renvoi au guide d'appel.
- Mise en forme des fiches intacte (texte interne modifié sur copie).

Co-Authored-By: Claude Opus 5.5 <noreply@anthropic.com>
</commit_message>
<xml_diff>
--- a/gestion/1 - Pitch du jeu.docx
+++ b/gestion/1 - Pitch du jeu.docx
@@ -21,7 +21,7 @@
         <w:pStyle w:val="NormalWeb"/>
       </w:pPr>
       <w:r>
-        <w:t>Et si on faisait un loup garou immersif (avec sons et lumières) en le rendant plus dynamique et en donnant un rôle aux personnes qui sont mortes ?</w:t>
+        <w:t>Et si on faisait un Loup-Garou immersif (avec sons et lumières) en le rendant plus dynamique et en donnant un rôle aux personnes qui sont mortes ?</w:t>
       </w:r>
     </w:p>
     <w:p>
@@ -224,7 +224,7 @@
           <w:sz w:val="22"/>
           <w:szCs w:val="22"/>
         </w:rPr>
-        <w:t xml:space="preserve"> : à mesurer lors des prochaines parties, à priori 30 minutes max.</w:t>
+        <w:t xml:space="preserve"> : environ 30 minutes, deux parties dans l'heure (à confirmer sur de vraies soirées).</w:t>
       </w:r>
     </w:p>
     <w:p>

</xml_diff>